<commit_message>
feat: realistic submission content across all 25 parsing fixtures
</commit_message>
<xml_diff>
--- a/samples/fixtures/docx/cover-note.docx
+++ b/samples/fixtures/docx/cover-note.docx
@@ -2,6 +2,11 @@
 <file path=word/document.xml><?xml version="1.0" encoding="utf-8"?>
 <w:document xmlns:wpc="http://schemas.microsoft.com/office/word/2010/wordprocessingCanvas" xmlns:mo="http://schemas.microsoft.com/office/mac/office/2008/main" xmlns:mc="http://schemas.openxmlformats.org/markup-compatibility/2006" xmlns:mv="urn:schemas-microsoft-com:mac:vml" xmlns:o="urn:schemas-microsoft-com:office:office" xmlns:r="http://schemas.openxmlformats.org/officeDocument/2006/relationships" xmlns:m="http://schemas.openxmlformats.org/officeDocument/2006/math" xmlns:v="urn:schemas-microsoft-com:vml" xmlns:wp14="http://schemas.microsoft.com/office/word/2010/wordprocessingDrawing" xmlns:wp="http://schemas.openxmlformats.org/drawingml/2006/wordprocessingDrawing" xmlns:w10="urn:schemas-microsoft-com:office:word" xmlns:w="http://schemas.openxmlformats.org/wordprocessingml/2006/main" xmlns:w14="http://schemas.microsoft.com/office/word/2010/wordml" xmlns:wpg="http://schemas.microsoft.com/office/word/2010/wordprocessingGroup" xmlns:wpi="http://schemas.microsoft.com/office/word/2010/wordprocessingInk" xmlns:wne="http://schemas.microsoft.com/office/word/2006/wordml" xmlns:wps="http://schemas.microsoft.com/office/word/2010/wordprocessingShape" mc:Ignorable="w14 wp14">
   <w:body>
+    <w:p>
+      <w:r>
+        <w:t>COVER NOTE - Harborline Traders Ltd renewal</w:t>
+      </w:r>
+    </w:p>
     <w:p>
       <w:r>
         <w:t>Broker Acme Marine Ltd TIV 6500000 steel</w:t>
@@ -9,7 +14,22 @@
     </w:p>
     <w:p>
       <w:r>
-        <w:t>Warehouse at 12 Port Road is sprinklered.</w:t>
+        <w:t>Insured trades as a general warehousing and distribution group from three scheduled sites, all sprinklered with maintained alarm systems.</w:t>
+      </w:r>
+    </w:p>
+    <w:p>
+      <w:r>
+        <w:t>Warehouse at 12 Port Road is sprinklered. Two further sites at 44 Quay Street and 7 Dockside carry limits of $4,500,000 and $1,200,000.</w:t>
+      </w:r>
+    </w:p>
+    <w:p>
+      <w:r>
+        <w:t>Commodity is steel machinery parts packed in export cases.</w:t>
+      </w:r>
+    </w:p>
+    <w:p>
+      <w:r>
+        <w:t>Cover sought is All Risk including storage and transit, valuation CIF+10%, twelve months. Expiring premium not disclosed.</w:t>
       </w:r>
     </w:p>
     <w:sectPr>

</xml_diff>